<commit_message>
Fixed #557 M2Doc templates with custom Java services out side of a Java project doesn't work.
</commit_message>
<xml_diff>
--- a/tests/org.obeonetwork.m2doc.tests/resources/template-extend/nominal/nominal-template.docx
+++ b/tests/org.obeonetwork.m2doc.tests/resources/template-extend/nominal/nominal-template.docx
@@ -27,13 +27,7 @@
         <w:rPr>
           <w:lang w:val="en-US"/>
         </w:rPr>
-        <w:t xml:space="preserve">OVERRIDEN: </w:t>
-      </w:r>
-      <w:r>
-        <w:rPr>
-          <w:lang w:val="en-US"/>
-        </w:rPr>
-        <w:t>{m: a + a}</w:t>
+        <w:t>OVERRIDEN: {m: a + a}</w:t>
       </w:r>
     </w:p>
     <w:p>

</xml_diff>